<commit_message>
fix(plantillas): duplicados de numeración en runs propios eliminados
Co-Authored-By: Claude Opus 4.8 <noreply@anthropic.com>
</commit_message>
<xml_diff>
--- a/app/plantillas/SARGO 78179175-K/CONTRATO ASTOP FT - Plazo Fijo.docx
+++ b/app/plantillas/SARGO 78179175-K/CONTRATO ASTOP FT - Plazo Fijo.docx
@@ -230,7 +230,7 @@
         <w:rPr>
           <w:b/>
         </w:rPr>
-        <w:t xml:space="preserve">1 </w:t>
+        <w:t xml:space="preserve"/>
       </w:r>
       <w:r>
         <w:rPr>
@@ -740,7 +740,7 @@
         <w:rPr>
           <w:b/>
         </w:rPr>
-        <w:t xml:space="preserve">4 </w:t>
+        <w:t xml:space="preserve"/>
       </w:r>
       <w:r>
         <w:rPr>

</xml_diff>

<commit_message>
fix(plantillas): números residuales ante enumerados de letras (20 casos)
Co-Authored-By: Claude Opus 4.8 <noreply@anthropic.com>
</commit_message>
<xml_diff>
--- a/app/plantillas/SARGO 78179175-K/CONTRATO ASTOP FT - Plazo Fijo.docx
+++ b/app/plantillas/SARGO 78179175-K/CONTRATO ASTOP FT - Plazo Fijo.docx
@@ -662,7 +662,7 @@
         <w:rPr>
           <w:b/>
         </w:rPr>
-        <w:t>1  </w:t>
+        <w:t/>
       </w:r>
       <w:r>
         <w:rPr>
@@ -684,7 +684,7 @@
         <w:rPr>
           <w:b/>
         </w:rPr>
-        <w:t>2  </w:t>
+        <w:t/>
       </w:r>
       <w:r>
         <w:rPr>
@@ -702,7 +702,7 @@
         <w:rPr>
           <w:b/>
         </w:rPr>
-        <w:t>3  </w:t>
+        <w:t/>
       </w:r>
       <w:r>
         <w:rPr>
@@ -758,7 +758,7 @@
         <w:rPr>
           <w:b/>
         </w:rPr>
-        <w:t>5  </w:t>
+        <w:t/>
       </w:r>
       <w:r>
         <w:rPr>
@@ -776,7 +776,7 @@
         <w:rPr>
           <w:b/>
         </w:rPr>
-        <w:t>6  </w:t>
+        <w:t/>
       </w:r>
       <w:r>
         <w:rPr>

</xml_diff>

<commit_message>
feat(solicitudes): plan Isapre UF/$, observaciones a Remuneración y gratificación dinámica
- Salud: al elegir Isapre se pide nombre + valor del plan en UF o pesos
  (cols trabajadores.salud_plan_unidad/valor, RPC ya migrada).
- Observaciones del contrato ahora en la sección Remuneración como
  "Otras consideraciones remuneracionales" con guía de uso.
- Gratificación con 4 opciones (sin / 25% / tope / manual + monto),
  replicada en el form interno; remuneracion.gratificacion_tipo nuevo.
- Las 11 plantillas .docx con cláusula de gratificación llevan ahora el
  placeholder {GRATIFICACION_TEXTO}; contrato-generacion.ts redacta la
  cláusula según la opción elegida (script de parcheo en scripts/).

Co-Authored-By: Claude Fable 5 <noreply@anthropic.com>
</commit_message>
<xml_diff>
--- a/app/plantillas/SARGO 78179175-K/CONTRATO ASTOP FT - Plazo Fijo.docx
+++ b/app/plantillas/SARGO 78179175-K/CONTRATO ASTOP FT - Plazo Fijo.docx
@@ -1139,27 +1139,27 @@
         <w:t>Gratificación Legal:</w:t>
       </w:r>
       <w:r>
-        <w:t xml:space="preserve"> Adicionalmente, el Empleador pagará la gratificación legal mensual conforme al </w:t>
-      </w:r>
-      <w:r>
-        <w:rPr>
-          <w:b/>
-          <w:bCs/>
-        </w:rPr>
-        <w:t>Artículo 50 del Código del Trabajo</w:t>
-      </w:r>
-      <w:r>
-        <w:t xml:space="preserve">, equivalente al 25% de la remuneración mensual con el tope legal de </w:t>
-      </w:r>
-      <w:r>
-        <w:rPr>
-          <w:b/>
-          <w:bCs/>
-        </w:rPr>
-        <w:t>4,75 Ingresos Mínimos Mensuales</w:t>
-      </w:r>
-      <w:r>
-        <w:t xml:space="preserve"> (prorrateados).</w:t>
+        <w:t xml:space="preserve"> {GRATIFICACION_TEXTO}</w:t>
+      </w:r>
+      <w:r>
+        <w:rPr>
+          <w:b/>
+          <w:bCs/>
+        </w:rPr>
+        <w:t/>
+      </w:r>
+      <w:r>
+        <w:t xml:space="preserve"/>
+      </w:r>
+      <w:r>
+        <w:rPr>
+          <w:b/>
+          <w:bCs/>
+        </w:rPr>
+        <w:t/>
+      </w:r>
+      <w:r>
+        <w:t xml:space="preserve">.</w:t>
       </w:r>
     </w:p>
     <w:p>

</xml_diff>

<commit_message>
fix(plantillas): horas semanales parametrizadas en los 11 contratos SARGO
{HORAS_SEMANALES} en la cláusula de jornada (completa → 42, parcial →
horas pactadas). Corrige 4 plantillas que decían "44 horas semanales",
tope derogado desde el 26-04-2026 (Ley 21.561). La plantilla 21h traía
NBSP entre número y "horas" — las regex del script ahora lo toleran.

Co-Authored-By: Claude Fable 5 <noreply@anthropic.com>
</commit_message>
<xml_diff>
--- a/app/plantillas/SARGO 78179175-K/CONTRATO ASTOP FT - Plazo Fijo.docx
+++ b/app/plantillas/SARGO 78179175-K/CONTRATO ASTOP FT - Plazo Fijo.docx
@@ -370,14 +370,14 @@
         <w:t>Artículo 38 del Código del Trabajo</w:t>
       </w:r>
       <w:r>
-        <w:t xml:space="preserve"> (faenas de proceso continuo), la jornada ordinaria de trabajo será de </w:t>
-      </w:r>
-      <w:r>
-        <w:rPr>
-          <w:b/>
-          <w:bCs/>
-        </w:rPr>
-        <w:t>42 horas semanales</w:t>
+        <w:t xml:space="preserve"> (faenas de proceso continuo), la jornada ordinaria de trabajo será de {HORAS_SEMANALES} horas semanales</w:t>
+      </w:r>
+      <w:r>
+        <w:rPr>
+          <w:b/>
+          <w:bCs/>
+        </w:rPr>
+        <w:t/>
       </w:r>
       <w:r>
         <w:t xml:space="preserve"> (ajustándose automáticamente a los máximos legales vigentes según la gradualidad de la Ley 40 Horas), distribuidas de Lunes a Domingo, en un régimen de turnos rotativos.</w:t>

</xml_diff>